<commit_message>
describe what changed, e.g. Added percentage-based budget calculation
</commit_message>
<xml_diff>
--- a/code without jinja.docx
+++ b/code without jinja.docx
@@ -57674,7 +57674,7 @@
     </w:p>
     <w:p>
       <w:r>
-        <w:pict w14:anchorId="2836E42C">
+        <w:pict w14:anchorId="4BFE3954">
           <v:rect id="Horizontal Line 1" o:spid="_x0000_s1026" alt="" style="width:468pt;height:.1pt;visibility:visible;mso-wrap-style:square;mso-width-percent:0;mso-height-percent:0;mso-left-percent:-10001;mso-top-percent:-10001;mso-position-horizontal:absolute;mso-position-horizontal-relative:char;mso-position-vertical:absolute;mso-position-vertical-relative:line;mso-width-percent:0;mso-height-percent:0;mso-left-percent:-10001;mso-top-percent:-10001;v-text-anchor:top" filled="f">
             <o:lock v:ext="edit" rotation="t" aspectratio="t" verticies="t" text="t" shapetype="t"/>
             <w10:anchorlock/>
@@ -59304,6 +59304,100 @@
           <w:color w:val="000000"/>
         </w:rPr>
         <w:t>, and whether you should reset it to something new before handing over, so you're not still holding a working login to a system that's no longer yours to access. Want help drafting that "walk away cleanly" checklist too, or is this mainly for a coursework submission where the README above covers what you need?</w:t>
+      </w:r>
+    </w:p>
+    <w:p>
+      <w:pPr>
+        <w:pStyle w:val="NormalWeb"/>
+        <w:rPr>
+          <w:color w:val="000000"/>
+        </w:rPr>
+      </w:pPr>
+      <w:r>
+        <w:rPr>
+          <w:color w:val="000000"/>
+        </w:rPr>
+        <w:t>git branch -M main</w:t>
+      </w:r>
+    </w:p>
+    <w:p>
+      <w:pPr>
+        <w:pStyle w:val="font-claude-response-body"/>
+        <w:rPr>
+          <w:color w:val="000000"/>
+        </w:rPr>
+      </w:pPr>
+    </w:p>
+    <w:p>
+      <w:pPr>
+        <w:pStyle w:val="NormalWeb"/>
+        <w:rPr>
+          <w:color w:val="000000"/>
+        </w:rPr>
+      </w:pPr>
+      <w:r>
+        <w:rPr>
+          <w:color w:val="000000"/>
+        </w:rPr>
+        <w:t>git remote add origin</w:t>
+      </w:r>
+      <w:r>
+        <w:rPr>
+          <w:rStyle w:val="apple-converted-space"/>
+          <w:color w:val="000000"/>
+        </w:rPr>
+        <w:t> </w:t>
+      </w:r>
+    </w:p>
+    <w:p>
+      <w:pPr>
+        <w:pStyle w:val="NormalWeb"/>
+        <w:rPr>
+          <w:color w:val="000000"/>
+        </w:rPr>
+      </w:pPr>
+      <w:hyperlink r:id="rId7" w:tgtFrame="_blank" w:history="1">
+        <w:r>
+          <w:rPr>
+            <w:rStyle w:val="Hyperlink"/>
+          </w:rPr>
+          <w:t>https://github.com/Roshan4900/Budget-tracking-and-monitoring-.git</w:t>
+        </w:r>
+      </w:hyperlink>
+    </w:p>
+    <w:p>
+      <w:pPr>
+        <w:pStyle w:val="NormalWeb"/>
+        <w:rPr>
+          <w:color w:val="000000"/>
+        </w:rPr>
+      </w:pPr>
+      <w:r>
+        <w:rPr>
+          <w:color w:val="000000"/>
+        </w:rPr>
+        <w:t>git remote add origin</w:t>
+      </w:r>
+      <w:r>
+        <w:rPr>
+          <w:rStyle w:val="apple-converted-space"/>
+          <w:color w:val="000000"/>
+        </w:rPr>
+        <w:t> </w:t>
+      </w:r>
+    </w:p>
+    <w:p>
+      <w:pPr>
+        <w:pStyle w:val="NormalWeb"/>
+        <w:rPr>
+          <w:color w:val="000000"/>
+        </w:rPr>
+      </w:pPr>
+      <w:r>
+        <w:rPr>
+          <w:color w:val="000000"/>
+        </w:rPr>
+        <w:t>git push -u origin main</w:t>
       </w:r>
     </w:p>
     <w:p/>
@@ -60867,6 +60961,18 @@
     <w:basedOn w:val="DefaultParagraphFont"/>
     <w:rsid w:val="0085423D"/>
   </w:style>
+  <w:style w:type="character" w:styleId="FollowedHyperlink">
+    <w:name w:val="FollowedHyperlink"/>
+    <w:basedOn w:val="DefaultParagraphFont"/>
+    <w:uiPriority w:val="99"/>
+    <w:semiHidden/>
+    <w:unhideWhenUsed/>
+    <w:rsid w:val="00302326"/>
+    <w:rPr>
+      <w:color w:val="96607D" w:themeColor="followedHyperlink"/>
+      <w:u w:val="single"/>
+    </w:rPr>
+  </w:style>
 </w:styles>
 </file>
 

</xml_diff>